<commit_message>
Stop describing every baseline flag as same-day contact
Only the two PHQ-9 flags are same-day; alcohol, eating, gambling and food
flags are documented at the next visit. Rename the Admin action to "Mark
contact documented (resumes randomization)" and reword CLAUDE.md and the
architecture, JITAI overview and distress pipeline docx to match. Tests pin
the label.
</commit_message>
<xml_diff>
--- a/Resources/REACT_Architecture.docx
+++ b/Resources/REACT_Architecture.docx
@@ -6554,7 +6554,7 @@
     <w:p>
       <w:pPr/>
       <w:r>
-        <w:t>Section 11 distress override state (added 2026-09-21, migration 0048). While a flag is active, evaluate_jitai_triggers suppresses randomization for that participant and logs the decision point with suppression_reason 'distress_baseline' or 'distress_momentary'. Baseline flags come from the Qualtrics baseline screens and pause prompts until staff document same-day contact; staff can create them by hand in Django Admin or, since 2026-09-21, by running `manage.py import_baseline_distress_flags --file &lt;path&gt; [--dry-run]` against a scored Qualtrics export (analytics/baseline_survey_scoring/section11.py) — --id-column defaults to participant_id and --id-field to user_id (the export's participant_id is the numeric User.user_id), both overridable. Momentary flags are raised by POST /ema/responses/ when a submitted check-in has ANY of B1_valence == 1, B2_stress == 7, B1_affect_sad == 5 or B1_affect_anxious == 5 (exact values confirmed by Dr. Chang 2026-09-22; constants in dashboard/data/config.py). Only signal codes are stored — never a score or free text (IRB).</w:t>
+        <w:t>Section 11 distress override state (added 2026-09-21, migration 0048). While a flag is active, evaluate_jitai_triggers suppresses randomization for that participant and logs the decision point with suppression_reason 'distress_baseline' or 'distress_momentary'. Baseline flags come from the Qualtrics baseline screens and pause prompts until staff mark the contact documented; staff can create them by hand in Django Admin or, since 2026-09-21, by running `manage.py import_baseline_distress_flags --file &lt;path&gt; [--dry-run]` against a scored Qualtrics export (analytics/baseline_survey_scoring/section11.py) — --id-column defaults to participant_id and --id-field to user_id (the export's participant_id is the numeric User.user_id), both overridable. Momentary flags are raised by POST /ema/responses/ when a submitted check-in has ANY of B1_valence == 1, B2_stress == 7, B1_affect_sad == 5 or B1_affect_anxious == 5 (exact values confirmed by Dr. Chang 2026-09-22; constants in dashboard/data/config.py). Only signal codes are stored — never a score or free text (IRB).</w:t>
       </w:r>
     </w:p>
     <w:tbl>
@@ -6956,7 +6956,7 @@
               <w:rPr>
                 <w:sz w:val="17"/>
               </w:rPr>
-              <w:t>nullable — baseline flags: set by the Django Admin action 'Mark same-day contact documented'; a baseline flag stops pausing prompts once set</w:t>
+              <w:t>nullable — baseline flags: set by the Django Admin action 'Mark contact documented'; a baseline flag stops pausing prompts once set</w:t>
             </w:r>
           </w:p>
         </w:tc>
@@ -7060,7 +7060,7 @@
     </w:p>
     <w:p>
       <w:r>
-        <w:t>Section 11 distress override (added 2026-09-21): built in code (backend/app/distress.py, DistressFlag model, migration 0048), checked in _evaluate_user after the run-in gate and before the randomization draw. Baseline path: Qualtrics baseline screens raise a flag with signal codes phq9_self_harm, phq9_severity, scoff, audit_c, problem_gambling, food_insecurity or free_text_risk (codes only — never a score or free text); prompts stay paused until staff document same-day contact via the Django Admin action 'Mark same-day contact documented', after which randomization resumes. Momentary path: a submitted check-in with ANY of B1_valence == 1, B2_stress == 7, B1_affect_sad == 5 or B1_affect_anxious == 5 — exact values, not thresholds, confirmed by Dr. Chang 2026-09-22 (DISTRESS_B1_VALENCE_FLOOR=1, DISTRESS_B2_STRESS_CEILING=7, DISTRESS_B1_AFFECT_CEILING=5 in dashboard/data/config.py) — pauses prompts for DISTRESS_MOMENTARY_PAUSE_HOURS (24). Signal codes are b1_low_valence, b2_high_stress, b1_affect_sad and b1_affect_anxious; several can fire on one check-in and all are recorded. Skipped items never fire, and out-of-range values are rejected by the serializer before storage. This is separate from the ROUTING_TRIGGER_RULES inequality cutoffs used for coping-message topic selection. POST /ema/responses/ returns a resource_card after any check-in submitted under an active override, and the mobile EMA modal shows it in a 'resources' phase (Done button, tap-to-call). The card message opens with the 911 instruction, and RESOURCE_CARD_RESOURCES holds the seven resources from the study's resource document (Campus Counseling Center, 988 Suicide and Crisis Lifeline, Hitchcock Field &amp; Fork Pantry, National Alliance for Eating Disorders Helpline, SAMHSA National Helpline, National Problem Gambling Helpline, Florida's Gambling Helpline) with digits-only contacts for tap-to-call. Decisions by Dr. Chang 2026-09-23: staff alerts come from Qualtrics (it emails the PI and staff when a flagged baseline is submitted), not the backend, and the import only suppresses; contact_documented_at is a timestamp only, with who called and what was given kept in the staff contact log outside Django; staff mark a baseline flag documented in Django Admin (same day for the two PHQ-9 flags, at the next visit for alcohol/eating/gambling/food), and an unmarked flag suppresses that participant for the rest of the study by design; in-app (momentary) flags are resource-card-only with no staff notice; free_text_risk stays a manual Admin flag. Still open: (1) the import has not been run on a real export (it waits for the RS01-RS04 accounts); (2) the mobile resource screen must be tested on iPhone and Android and shipped to all participants before Day 8 (2026-09-28); (3) the backend and migration 0048 must be deployed first; (4) the backend cannot see the app version, so old builds are suppressed but show no card. Open, unconfirmed: the alcohol override's 'other' gender default (lower threshold) is an interim choice, not yet sent to Dr. Chang for sign-off.</w:t>
+        <w:t>Section 11 distress override (added 2026-09-21): built in code (backend/app/distress.py, DistressFlag model, migration 0048), checked in _evaluate_user after the run-in gate and before the randomization draw. Baseline path: Qualtrics baseline screens raise a flag with signal codes phq9_self_harm, phq9_severity, scoff, audit_c, problem_gambling, food_insecurity or free_text_risk (codes only — never a score or free text); prompts stay paused until staff mark the contact documented via the Django Admin action 'Mark contact documented', after which randomization resumes. Momentary path: a submitted check-in with ANY of B1_valence == 1, B2_stress == 7, B1_affect_sad == 5 or B1_affect_anxious == 5 — exact values, not thresholds, confirmed by Dr. Chang 2026-09-22 (DISTRESS_B1_VALENCE_FLOOR=1, DISTRESS_B2_STRESS_CEILING=7, DISTRESS_B1_AFFECT_CEILING=5 in dashboard/data/config.py) — pauses prompts for DISTRESS_MOMENTARY_PAUSE_HOURS (24). Signal codes are b1_low_valence, b2_high_stress, b1_affect_sad and b1_affect_anxious; several can fire on one check-in and all are recorded. Skipped items never fire, and out-of-range values are rejected by the serializer before storage. This is separate from the ROUTING_TRIGGER_RULES inequality cutoffs used for coping-message topic selection. POST /ema/responses/ returns a resource_card after any check-in submitted under an active override, and the mobile EMA modal shows it in a 'resources' phase (Done button, tap-to-call). The card message opens with the 911 instruction, and RESOURCE_CARD_RESOURCES holds the seven resources from the study's resource document (Campus Counseling Center, 988 Suicide and Crisis Lifeline, Hitchcock Field &amp; Fork Pantry, National Alliance for Eating Disorders Helpline, SAMHSA National Helpline, National Problem Gambling Helpline, Florida's Gambling Helpline) with digits-only contacts for tap-to-call. Decisions by Dr. Chang 2026-09-23: staff alerts come from Qualtrics (it emails the PI and staff when a flagged baseline is submitted), not the backend, and the import only suppresses; contact_documented_at is a timestamp only, with who called and what was given kept in the staff contact log outside Django; staff mark a baseline flag documented in Django Admin (same day for the two PHQ-9 flags, at the next visit for alcohol/eating/gambling/food), and an unmarked flag suppresses that participant for the rest of the study by design; in-app (momentary) flags are resource-card-only with no staff notice; free_text_risk stays a manual Admin flag. Still open: (1) the import has not been run on a real export (it waits for the RS01-RS04 accounts); (2) the mobile resource screen must be tested on iPhone and Android and shipped to all participants before Day 8 (2026-09-28); (3) the backend and migration 0048 must be deployed first; (4) the backend cannot see the app version, so old builds are suppressed but show no card. Open, unconfirmed: the alcohol override's 'other' gender default (lower threshold) is an interim choice, not yet sent to Dr. Chang for sign-off.</w:t>
       </w:r>
     </w:p>
     <w:p>
@@ -10777,7 +10777,7 @@
           </w:tcPr>
           <w:p>
             <w:r>
-              <w:t>Safety — staff-documented same-day contact; ends a baseline pause</w:t>
+              <w:t>Safety — staff-documented contact; ends a baseline pause</w:t>
             </w:r>
           </w:p>
         </w:tc>

</xml_diff>

<commit_message>
Make alcohol flags and gambling to alert only
</commit_message>
<xml_diff>
--- a/Resources/REACT_Architecture.docx
+++ b/Resources/REACT_Architecture.docx
@@ -344,7 +344,7 @@
           </w:tcPr>
           <w:p>
             <w:r>
-              <w:t>Runs on the same short interval as evaluate_jitai_triggers. The notification window (9am-9pm Eastern, NOTIFICATION_WINDOW_START_HOUR/END_HOUR) is divided into SCHEDULED_CHECK_IN_DAILY_CAP (6) fixed 2-hour slots. For each enrolled participant, each slot gets at most one neutral 'time to check in' push (visible title/body, no intervention content), sent 30 minutes after the slot opens if that slot's check-in hasn't already been completed — and never repeated once the slot's window closes (Dr. Chang, 2026-08-21: a missed check-in is data, not something to nudge repeatedly). Skipped entirely while a JITAI outcome window is active. Logs a CheckinReminder row (with which slot it was for) only on confirmed send, so analysis can distinguish a check-in completed after a nudge from a spontaneous one.</w:t>
+              <w:t>Runs on the same short interval as evaluate_jitai_triggers. The notification window (9am-9pm Eastern, NOTIFICATION_WINDOW_START_HOUR/END_HOUR) is divided into SCHEDULED_CHECK_IN_DAILY_CAP (6) fixed 2-hour slots. For each enrolled participant, each slot gets at most one neutral 'time to check in' push (visible title/body, no intervention content), sent 30 minutes after the slot opens if that slot's check-in hasn't already been completed — and never repeated once the slot's window closes (Dr. Chang, 2026-08-21: a missed check-in is data, not something to nudge repeatedly). While any JITAI outcome window is open the slot reminders are skipped; the one reminder sent in that case is the outcome check-in reminder (at or after minute 60 of the window, if unanswered and under the daily post-prompt cap), recorded as a CheckinReminder keyed by jitai_log rather than by slot. Logs a CheckinReminder row (with which slot it was for, or which decision point for an outcome reminder) only on confirmed send, so analysis can distinguish a check-in completed after a nudge from a spontaneous one.</w:t>
             </w:r>
           </w:p>
         </w:tc>
@@ -7371,7 +7371,7 @@
     </w:p>
     <w:p>
       <w:r>
-        <w:t>Step 7 — Outcome-window survey. Once C0 is resolved, the first check-in within 2 hours of the anchor (push delivery for a sent prompt, decision time for an unsent one; see the 2026-10-03 note below) becomes a time-locked 'post_prompt' EMA (B1, B2, B4-B7), capped at POST_PROMPT_CHECK_IN_DAILY_CAP per day. Changed 2026-10-03: the outcome window now opens at every randomized decision point (JITAILog.randomization_draw not null), both arms, whether or not a prompt was sent. The window is anchored at push_sent_at for a sent prompt and at triggered_at for an unsent decision (EMANextView uses _outcome_window_anchor). Suppressed rows (run-in, distress, cooldown, daily cap; draw null) open no window. The C0 prompt_feedback check-in is still offered only after a delivered prompt. Cooldown/daily-cap enforcement and the reminder logic (still skipped during any active window) are unchanged. Amended 2026-10-04: when a decision point is randomized out (randomization_draw not null, no JITAI prompt sent), the participant now also receives the existing visible check-in reminder push (send_checkin_reminder, data type 'checkin_reminder', text 'Time for your check-in.') at decision time, so the outcome check-in is actively announced in the unsent branch, mirroring the sent arm's timing. It carries no jitai_log_id, so no receipt is written onto the unsent log; the JITAILog keeps status/delivery_status 'not_sent' and push_sent_at null. The app already opens the EMA screen on tapping a checkin_reminder push, so there is no mobile change. Suppressed decisions (draw null) send nothing, and sent decisions send only the JITAI push. How this interacts with the 60-minute hold is unconfirmed with Dr. Chang.</w:t>
+        <w:t>Step 7 — Outcome-window survey. Once C0 is resolved, the participant's outcome check-in becomes a time-locked 'post_prompt' EMA (B1, B2, B4-B7), capped at POST_PROMPT_CHECK_IN_DAILY_CAP per day, served from minute 60 to 120 after the decision point. Changed 2026-10-03, corrected 2026-10-05: every randomized decision point (JITAILog.randomization_draw not null, decision_point_id starting 'ema_'), whether or not a prompt was sent and in either arm, opens a 2-hour outcome window (OUTCOME_WINDOW_HOURS) anchored on JITAILog.decision_made_at (protocol 9.2), not on push_sent_at. Suppressed decisions (run-in, distress, cooldown, daily cap; draw null) and non-EMA decision points open no window. GET /ema/next/ still serves the C0 prompt_feedback rating first after a delivered prompt. Otherwise, during the first OUTCOME_CHECK_IN_DELAY_MINUTES = 60 (dashboard/data/config.py, provisional pending PI sign-off) it returns should_show false with reason 'outcome_window_pending' (outcome_window_active true, outcome_check_in_opens_at), so no scheduled check-in is offered either; from minute 60 to 120 it serves the post-prompt outcome items. One visible 'Time for your check-in.' reminder (the existing send_checkin_reminder push, no jitai_log_id) is sent per decision point at or after minute 60 if the outcome check-in is still unanswered and the daily post-prompt cap (POST_PROMPT_CHECK_IN_DAILY_CAP) is not reached; it is recorded as a CheckinReminder row keyed by jitai_log (migration 0050 made daily_count_at_send nullable and added the jitai_log FK; 0052 is a merge migration). It runs inside send_checkin_reminders, so it keeps the 9am-9pm Eastern gate and the 180 s cadence. A check-in inserted by that reminder is ema_type 'extra_check_in'; otherwise it is 'post_prompt'. While any window is open the scheduled slot reminders are skipped. The unsent arm gets no push at the decision. The 60-minute prompt cooldown is separate and unchanged.</w:t>
       </w:r>
     </w:p>
     <w:p>
@@ -11091,7 +11091,7 @@
           </w:tcPr>
           <w:p>
             <w:r>
-              <w:t>JITAI delivery audit — when a scheduling reminder was sent</w:t>
+              <w:t>JITAI delivery audit — when a scheduling or outcome-window reminder was sent</w:t>
             </w:r>
           </w:p>
         </w:tc>
@@ -11123,7 +11123,7 @@
           </w:tcPr>
           <w:p>
             <w:r>
-              <w:t>JITAI delivery audit — which of the day's check-in slots this reminder targeted</w:t>
+              <w:t>JITAI delivery audit — which of the day's check-in slots this reminder targeted; null for an outcome-window reminder (keyed by jitai_log instead, migration 0050)</w:t>
             </w:r>
           </w:p>
         </w:tc>

</xml_diff>